<commit_message>
Reescreve proposta de Pedidos de Informação como funcionalidade a criar
O documento passa a estar escrito no tom propositivo correto, descrevendo
a funcionalidade no futuro ("permitirá", "estará disponível", "o utilizador
poderá"), como proposta de criação e não de documentação de algo existente.

https://claude.ai/code/session_01NLFgbxzCib86yPwEfnRRtZ
</commit_message>
<xml_diff>
--- a/DGADR-I01209-202605-INF-DSIGA_DPGI_PedidosInformacao.docx
+++ b/DGADR-I01209-202605-INF-DSIGA_DPGI_PedidosInformacao.docx
@@ -17,7 +17,7 @@
     </w:p>
     <w:p>
       <w:pPr>
-        <w:spacing w:before="40" w:after="40"/>
+        <w:spacing w:before="0" w:after="40"/>
         <w:jc w:val="left"/>
       </w:pPr>
       <w:r>
@@ -69,7 +69,7 @@
     </w:p>
     <w:p>
       <w:pPr>
-        <w:spacing w:before="40" w:after="120"/>
+        <w:spacing w:before="0" w:after="120"/>
         <w:jc w:val="left"/>
       </w:pPr>
       <w:r>
@@ -96,19 +96,17 @@
           <w:b/>
           <w:sz w:val="22"/>
         </w:rPr>
-        <w:t>Proposta de melhoria da funcionalidade de Pedidos de Informação na Aplicação Móvel DGADR DigiSignage</w:t>
+        <w:t>Proposta de criação de funcionalidade de Pedidos de Informação na Aplicação Móvel DGADR DigiSignage</w:t>
       </w:r>
     </w:p>
     <w:p>
       <w:pPr>
-        <w:spacing w:before="200" w:after="80"/>
-        <w:jc w:val="left"/>
+        <w:spacing w:before="240" w:after="80"/>
       </w:pPr>
       <w:r>
         <w:rPr>
           <w:b/>
           <w:sz w:val="22"/>
-          <w:u w:val="none"/>
         </w:rPr>
         <w:t>Introdução</w:t>
       </w:r>
@@ -123,7 +121,7 @@
           <w:b w:val="0"/>
           <w:sz w:val="22"/>
         </w:rPr>
-        <w:t>A aplicação móvel DGADR DigiSignage integra uma funcionalidade dedicada ao apoio e orientação dos cidadãos e colaboradores na área dos Pedidos de Informação. Esta funcionalidade disponibiliza um assistente virtual inteligente, acessível a partir de qualquer dispositivo móvel, que responde em linguagem natural a questões relacionadas com os serviços, procedimentos e legislação da Direção-Geral de Agricultura e Desenvolvimento Rural (DGADR).</w:t>
+        <w:t>A DGADR recebe regularmente pedidos de informação de cidadãos, agricultores, técnicos e empresas do setor agrícola sobre os serviços, procedimentos e legislação da sua competência. O canal atualmente disponível para este efeito — o formulário de pedido de informação no portal institucional — implica tempos de resposta variáveis, dependentes da disponibilidade dos colaboradores, e não está otimizado para utilização em dispositivos móveis.</w:t>
       </w:r>
     </w:p>
     <w:p>
@@ -136,21 +134,19 @@
           <w:b w:val="0"/>
           <w:sz w:val="22"/>
         </w:rPr>
-        <w:t>A presente proposta descreve o funcionamento desta área, evidencia os seus benefícios para os utilizadores e para a organização, e identifica as oportunidades de melhoria que permitirão potenciar ainda mais o seu valor enquanto canal de comunicação e de prestação de serviços públicos digitais.</w:t>
+        <w:t>A presente proposta visa colmatar esta lacuna através da criação de uma funcionalidade dedicada aos Pedidos de Informação na aplicação móvel DGADR DigiSignage, tirando partido das capacidades de inteligência artificial generativa para disponibilizar respostas imediatas, em linguagem natural, em qualquer momento e a partir de qualquer localização.</w:t>
       </w:r>
     </w:p>
     <w:p>
       <w:pPr>
         <w:spacing w:before="240" w:after="80"/>
-        <w:jc w:val="left"/>
       </w:pPr>
       <w:r>
         <w:rPr>
           <w:b/>
           <w:sz w:val="22"/>
-          <w:u w:val="none"/>
         </w:rPr>
-        <w:t>Descrição da Funcionalidade</w:t>
+        <w:t>Descrição da Funcionalidade Proposta</w:t>
       </w:r>
     </w:p>
     <w:p>
@@ -163,7 +159,7 @@
           <w:b w:val="0"/>
           <w:sz w:val="22"/>
         </w:rPr>
-        <w:t>A área de Pedidos de Informação da aplicação DGADR DigiSignage funciona como um serviço de apoio inteligente, disponível 24 horas por dia, 7 dias por semana, diretamente no telemóvel do utilizador. Através de uma interface de conversação simples e intuitiva — semelhante a aplicações de mensagens do quotidiano —, o utilizador pode colocar questões em português e obter respostas imediatas, claras e contextualizadas.</w:t>
+        <w:t>Propõe-se a criação de uma área de Pedidos de Informação na aplicação DGADR DigiSignage, assente num assistente virtual inteligente acessível diretamente no telemóvel do utilizador. Através de uma interface de conversação simples e intuitiva — semelhante às aplicações de mensagens do quotidiano —, o utilizador poderá colocar questões em português corrente e obter respostas imediatas, claras e contextualizadas, sem necessidade de aguardar pelo horário de atendimento ou de preencher formulários.</w:t>
       </w:r>
     </w:p>
     <w:p>
@@ -176,7 +172,7 @@
           <w:b w:val="0"/>
           <w:sz w:val="22"/>
         </w:rPr>
-        <w:t>O assistente virtual está preparado para responder a questões sobre os principais temas da competência da DGADR, incluindo, entre outros:</w:t>
+        <w:t>O assistente estará preparado para responder a questões sobre os principais temas da competência da DGADR, incluindo, entre outros:</w:t>
       </w:r>
     </w:p>
     <w:p>
@@ -306,21 +302,19 @@
           <w:b w:val="0"/>
           <w:sz w:val="22"/>
         </w:rPr>
-        <w:t>Sempre que a questão colocada ultrapasse o âmbito da DGADR, o assistente identifica automaticamente a entidade competente — como a APA, o IFAP, a DGAV, o ICNF, as CCDR regionais, entre outras — e disponibiliza os respetivos contactos, evitando que o utilizador fique sem resposta.</w:t>
+        <w:t>Sempre que a questão colocada ultrapasse o âmbito da DGADR, o assistente identificará automaticamente a entidade competente — como a APA, o IFAP, a DGAV, o ICNF, as CCDR regionais, entre outras — e apresentará os respetivos contactos, garantindo que o utilizador é sempre orientado para a fonte correta.</w:t>
       </w:r>
     </w:p>
     <w:p>
       <w:pPr>
         <w:spacing w:before="240" w:after="80"/>
-        <w:jc w:val="left"/>
       </w:pPr>
       <w:r>
         <w:rPr>
           <w:b/>
           <w:sz w:val="22"/>
-          <w:u w:val="none"/>
         </w:rPr>
-        <w:t>Como Funciona</w:t>
+        <w:t>Como Funcionará</w:t>
       </w:r>
     </w:p>
     <w:p>
@@ -333,7 +327,7 @@
           <w:b w:val="0"/>
           <w:sz w:val="22"/>
         </w:rPr>
-        <w:t>O processo de utilização é simples e não requer qualquer conhecimento técnico:</w:t>
+        <w:t>O fluxo de utilização será simples e não exigirá qualquer conhecimento técnico:</w:t>
       </w:r>
     </w:p>
     <w:p>
@@ -398,7 +392,7 @@
         <w:rPr>
           <w:sz w:val="22"/>
         </w:rPr>
-        <w:t>O utilizador pode continuar a conversa, colocar novas questões ou gerir múltiplas conversas em simultâneo.</w:t>
+        <w:t>O utilizador poderá continuar a conversa, colocar novas questões ou gerir múltiplas conversas em simultâneo.</w:t>
       </w:r>
     </w:p>
     <w:p>
@@ -411,21 +405,19 @@
           <w:b w:val="0"/>
           <w:sz w:val="22"/>
         </w:rPr>
-        <w:t>Para situações que exijam acompanhamento formal, a funcionalidade disponibiliza ainda uma ligação direta ao canal tradicional de pedidos de informação da DGADR, assegurando a continuidade do serviço.</w:t>
+        <w:t>Para situações que exijam acompanhamento formal, a funcionalidade disponibilizará ainda uma ligação direta ao canal tradicional de pedidos de informação da DGADR, assegurando a continuidade e a rastreabilidade do processo.</w:t>
       </w:r>
     </w:p>
     <w:p>
       <w:pPr>
         <w:spacing w:before="240" w:after="80"/>
-        <w:jc w:val="left"/>
       </w:pPr>
       <w:r>
         <w:rPr>
           <w:b/>
           <w:sz w:val="22"/>
-          <w:u w:val="none"/>
         </w:rPr>
-        <w:t>Arquitetura Técnica (Nota Simplificada)</w:t>
+        <w:t>Componentes Técnicas (Nota Simplificada)</w:t>
       </w:r>
     </w:p>
     <w:p>
@@ -438,7 +430,7 @@
           <w:b w:val="0"/>
           <w:sz w:val="22"/>
         </w:rPr>
-        <w:t>A solução assenta em quatro componentes principais, que trabalham de forma integrada e transparente para o utilizador:</w:t>
+        <w:t>A solução assentará em quatro componentes principais, que funcionarão de forma integrada e transparente para o utilizador:</w:t>
       </w:r>
     </w:p>
     <w:p>
@@ -451,13 +443,13 @@
           <w:b/>
           <w:sz w:val="22"/>
         </w:rPr>
-        <w:t xml:space="preserve">• Base de Conhecimento Local: </w:t>
+        <w:t xml:space="preserve">• Base de Conhecimento Temática: </w:t>
       </w:r>
       <w:r>
         <w:rPr>
           <w:sz w:val="22"/>
         </w:rPr>
-        <w:t>conjunto de documentos temáticos sobre as áreas de competência da DGADR, disponíveis na aplicação, que permitem respostas mesmo sem ligação à internet.</w:t>
+        <w:t>conjunto de documentos sobre as áreas de competência da DGADR, incorporados na aplicação, que permitirão respostas mesmo sem ligação à internet.</w:t>
       </w:r>
     </w:p>
     <w:p>
@@ -476,7 +468,7 @@
         <w:rPr>
           <w:sz w:val="22"/>
         </w:rPr>
-        <w:t>quando necessário, o assistente consulta automaticamente os sítios oficiais da DGADR e do Ministério da Agricultura para garantir informação atualizada.</w:t>
+        <w:t>quando necessário, o assistente consultará automaticamente os sítios oficiais da DGADR e do Ministério da Agricultura, garantindo informação sempre atualizada.</w:t>
       </w:r>
     </w:p>
     <w:p>
@@ -489,13 +481,13 @@
           <w:b/>
           <w:sz w:val="22"/>
         </w:rPr>
-        <w:t xml:space="preserve">• Diretório de Contactos: </w:t>
+        <w:t xml:space="preserve">• Diretório de Contactos Integrado: </w:t>
       </w:r>
       <w:r>
         <w:rPr>
           <w:sz w:val="22"/>
         </w:rPr>
-        <w:t>base de dados com mais de 50 contactos internos organizados por divisão e mais de 20 entidades externas, permitindo encaminhamentos precisos e úteis.</w:t>
+        <w:t>base de dados com os contactos das divisões internas da DGADR e das principais entidades externas do setor, permitindo encaminhamentos precisos e úteis.</w:t>
       </w:r>
     </w:p>
     <w:p>
@@ -508,27 +500,25 @@
           <w:b/>
           <w:sz w:val="22"/>
         </w:rPr>
-        <w:t xml:space="preserve">• Modelo de Inteligência Artificial: </w:t>
+        <w:t xml:space="preserve">• Motor de Inteligência Artificial: </w:t>
       </w:r>
       <w:r>
         <w:rPr>
           <w:sz w:val="22"/>
         </w:rPr>
-        <w:t>motor de linguagem natural que interpreta as questões dos utilizadores e gera respostas coerentes, em português, adaptadas ao contexto da DGADR.</w:t>
+        <w:t>modelo de linguagem natural que interpretará as questões dos utilizadores e gerará respostas coerentes, em português, adaptadas ao contexto da DGADR.</w:t>
       </w:r>
     </w:p>
     <w:p>
       <w:pPr>
         <w:spacing w:before="240" w:after="80"/>
-        <w:jc w:val="left"/>
       </w:pPr>
       <w:r>
         <w:rPr>
           <w:b/>
           <w:sz w:val="22"/>
-          <w:u w:val="none"/>
         </w:rPr>
-        <w:t>Benefícios da Funcionalidade</w:t>
+        <w:t>Benefícios da Implementação</w:t>
       </w:r>
     </w:p>
     <w:p>
@@ -554,7 +544,7 @@
         <w:rPr>
           <w:sz w:val="22"/>
         </w:rPr>
-        <w:t>Disponibilidade permanente: o assistente está acessível a qualquer hora, sem necessidade de aguardar horários de atendimento ou filas de espera;</w:t>
+        <w:t>Disponibilidade permanente: o assistente estará acessível a qualquer hora, sem necessidade de aguardar horários de atendimento ou filas de espera;</w:t>
       </w:r>
     </w:p>
     <w:p>
@@ -567,7 +557,7 @@
         <w:rPr>
           <w:sz w:val="22"/>
         </w:rPr>
-        <w:t>Resposta imediata: o utilizador obtém informação relevante no imediato, reduzindo o tempo de espera face ao canal tradicional de pedidos escritos;</w:t>
+        <w:t>Resposta imediata: o utilizador obterá informação relevante no momento, reduzindo o tempo de espera face ao canal tradicional de pedidos escritos;</w:t>
       </w:r>
     </w:p>
     <w:p>
@@ -580,7 +570,7 @@
         <w:rPr>
           <w:sz w:val="22"/>
         </w:rPr>
-        <w:t>Linguagem acessível: as respostas são apresentadas em linguagem simples e clara, sem recurso a terminologia técnica desnecessária;</w:t>
+        <w:t>Linguagem acessível: as respostas serão apresentadas em linguagem simples e clara, sem recurso a terminologia técnica desnecessária;</w:t>
       </w:r>
     </w:p>
     <w:p>
@@ -593,7 +583,7 @@
         <w:rPr>
           <w:sz w:val="22"/>
         </w:rPr>
-        <w:t>Encaminhamento inteligente: quando a questão não é da competência da DGADR, o sistema identifica automaticamente a entidade correta, evitando que o utilizador fique sem orientação;</w:t>
+        <w:t>Encaminhamento inteligente: quando a questão não for da competência da DGADR, o sistema identificará automaticamente a entidade correta, evitando que o utilizador fique sem orientação;</w:t>
       </w:r>
     </w:p>
     <w:p>
@@ -606,7 +596,7 @@
         <w:rPr>
           <w:sz w:val="22"/>
         </w:rPr>
-        <w:t>Redução da carga administrativa: ao resolver um volume significativo de questões de forma autónoma, a funcionalidade liberta os colaboradores da DGADR para tarefas de maior valor acrescentado;</w:t>
+        <w:t>Redução da carga administrativa: ao resolver de forma autónoma um volume significativo de questões recorrentes, a funcionalidade libertará os colaboradores da DGADR para tarefas de maior valor acrescentado;</w:t>
       </w:r>
     </w:p>
     <w:p>
@@ -619,7 +609,7 @@
         <w:rPr>
           <w:sz w:val="22"/>
         </w:rPr>
-        <w:t>Acesso móvel e intuitivo: a interface de conversação é familiar para qualquer utilizador de telemóvel, não exigindo formação prévia;</w:t>
+        <w:t>Acesso móvel e intuitivo: a interface de conversação será familiar para qualquer utilizador de telemóvel, não exigindo formação prévia nem instalação de software adicional;</w:t>
       </w:r>
     </w:p>
     <w:p>
@@ -632,7 +622,7 @@
         <w:rPr>
           <w:sz w:val="22"/>
         </w:rPr>
-        <w:t>Informação consistente e fiável: as respostas baseiam-se em fontes oficiais e são atualizadas regularmente, assegurando coerência e rigor;</w:t>
+        <w:t>Informação consistente e fiável: as respostas basear-se-ão em fontes oficiais, assegurando coerência e rigor na informação prestada;</w:t>
       </w:r>
     </w:p>
     <w:p>
@@ -645,124 +635,17 @@
         <w:rPr>
           <w:sz w:val="22"/>
         </w:rPr>
-        <w:t>Cobertura multidivisional: o assistente abrange as principais áreas temáticas da DGADR, constituindo um ponto de entrada único para qualquer questão relacionada com a organização.</w:t>
+        <w:t>Cobertura multidivisional: o assistente abrangerá as principais áreas temáticas da DGADR, constituindo um ponto de entrada único para qualquer questão relacionada com a organização.</w:t>
       </w:r>
     </w:p>
     <w:p>
       <w:pPr>
         <w:spacing w:before="240" w:after="80"/>
-        <w:jc w:val="left"/>
       </w:pPr>
       <w:r>
         <w:rPr>
           <w:b/>
           <w:sz w:val="22"/>
-          <w:u w:val="none"/>
-        </w:rPr>
-        <w:t>Oportunidades de Melhoria</w:t>
-      </w:r>
-    </w:p>
-    <w:p>
-      <w:pPr>
-        <w:spacing w:before="0" w:after="60"/>
-        <w:jc w:val="left"/>
-      </w:pPr>
-      <w:r>
-        <w:rPr>
-          <w:b w:val="0"/>
-          <w:sz w:val="22"/>
-        </w:rPr>
-        <w:t>Com o objetivo de ampliar o alcance e a eficácia da funcionalidade, propõem-se as seguintes melhorias:</w:t>
-      </w:r>
-    </w:p>
-    <w:p>
-      <w:pPr>
-        <w:pStyle w:val="ListBullet"/>
-        <w:spacing w:before="0" w:after="60"/>
-        <w:ind w:left="567"/>
-      </w:pPr>
-      <w:r>
-        <w:rPr>
-          <w:sz w:val="22"/>
-        </w:rPr>
-        <w:t>Alargamento da base de conhecimento: incorporação de mais documentação técnica, regulamentação europeia e nacional e informação de apoio sobre programas de financiamento agrícola (PEPAC, etc.);</w:t>
-      </w:r>
-    </w:p>
-    <w:p>
-      <w:pPr>
-        <w:pStyle w:val="ListBullet"/>
-        <w:spacing w:before="0" w:after="60"/>
-        <w:ind w:left="567"/>
-      </w:pPr>
-      <w:r>
-        <w:rPr>
-          <w:sz w:val="22"/>
-        </w:rPr>
-        <w:t>Integração com o portal de pedidos formais: possibilidade de iniciar, diretamente na aplicação, um pedido de informação formal ao abrigo da legislação vigente, com rastreabilidade do processo;</w:t>
-      </w:r>
-    </w:p>
-    <w:p>
-      <w:pPr>
-        <w:pStyle w:val="ListBullet"/>
-        <w:spacing w:before="0" w:after="60"/>
-        <w:ind w:left="567"/>
-      </w:pPr>
-      <w:r>
-        <w:rPr>
-          <w:sz w:val="22"/>
-        </w:rPr>
-        <w:t>Histórico de conversas: manutenção de um arquivo consultável das interações anteriores, permitindo ao utilizador revisitar respostas já obtidas;</w:t>
-      </w:r>
-    </w:p>
-    <w:p>
-      <w:pPr>
-        <w:pStyle w:val="ListBullet"/>
-        <w:spacing w:before="0" w:after="60"/>
-        <w:ind w:left="567"/>
-      </w:pPr>
-      <w:r>
-        <w:rPr>
-          <w:sz w:val="22"/>
-        </w:rPr>
-        <w:t>Avaliação da qualidade das respostas: mecanismo simples de classificação (positivo/negativo) que permita monitorizar e melhorar continuamente a qualidade do assistente;</w:t>
-      </w:r>
-    </w:p>
-    <w:p>
-      <w:pPr>
-        <w:pStyle w:val="ListBullet"/>
-        <w:spacing w:before="0" w:after="60"/>
-        <w:ind w:left="567"/>
-      </w:pPr>
-      <w:r>
-        <w:rPr>
-          <w:sz w:val="22"/>
-        </w:rPr>
-        <w:t>Notificações de atualização legislativa: alerta automático aos utilizadores quando existam alterações relevantes nas matérias sobre as quais já obtiveram informação;</w:t>
-      </w:r>
-    </w:p>
-    <w:p>
-      <w:pPr>
-        <w:pStyle w:val="ListBullet"/>
-        <w:spacing w:before="0" w:after="60"/>
-        <w:ind w:left="567"/>
-      </w:pPr>
-      <w:r>
-        <w:rPr>
-          <w:sz w:val="22"/>
-        </w:rPr>
-        <w:t>Extensão ao portal intranet: disponibilização da mesma funcionalidade no ambiente intranet da DGADR para utilização pelos colaboradores internos.</w:t>
-      </w:r>
-    </w:p>
-    <w:p>
-      <w:pPr>
-        <w:spacing w:before="240" w:after="80"/>
-        <w:jc w:val="left"/>
-      </w:pPr>
-      <w:r>
-        <w:rPr>
-          <w:b/>
-          <w:sz w:val="22"/>
-          <w:u w:val="none"/>
         </w:rPr>
         <w:t>Conclusão</w:t>
       </w:r>
@@ -777,7 +660,7 @@
           <w:b w:val="0"/>
           <w:sz w:val="22"/>
         </w:rPr>
-        <w:t>A funcionalidade de Pedidos de Informação da aplicação DGADR DigiSignage representa uma melhoria significativa no modo como a DGADR presta informação e orienta os seus utilizadores. Trata-se de uma solução tecnologicamente atual, funcional e de fácil utilização, que coloca ao dispor do cidadão e dos colaboradores um canal de apoio inteligente, disponível em permanência e integrado com as fontes oficiais da organização.</w:t>
+        <w:t>A criação de uma funcionalidade de Pedidos de Informação na aplicação DGADR DigiSignage constituirá uma melhoria concreta e significativa na forma como a DGADR presta informação ao cidadão e orienta os seus utilizadores. Trata-se de uma solução tecnologicamente atual, funcional e de fácil utilização, que colocará ao dispor do cidadão e dos colaboradores um canal de apoio inteligente, disponível em permanência e integrado com as fontes oficiais da organização.</w:t>
       </w:r>
     </w:p>
     <w:p>
@@ -790,7 +673,7 @@
           <w:b w:val="0"/>
           <w:sz w:val="22"/>
         </w:rPr>
-        <w:t>A presente proposta visa não apenas documentar e valorizar a solução já existente, mas também identificar os vetores de desenvolvimento que permitirão transformá-la num instrumento cada vez mais completo, eficiente e alinhado com os objetivos de modernização administrativa e de melhoria da qualidade do serviço público da DGADR.</w:t>
+        <w:t>A proposta é tecnicamente exequível no âmbito da aplicação DGADR DigiSignage já em desenvolvimento, não exigindo infraestrutura adicional de relevo, e o seu impacto positivo na qualidade do serviço prestado ao cidadão é imediato e mensurável.</w:t>
       </w:r>
     </w:p>
     <w:p>
@@ -803,7 +686,7 @@
           <w:b w:val="0"/>
           <w:sz w:val="22"/>
         </w:rPr>
-        <w:t>Pelo exposto, o signatário propõe superiormente, a título de melhoria, o aprofundamento e alargamento da funcionalidade de Pedidos de Informação na aplicação DGADR DigiSignage, como medida de reforço da qualidade do serviço prestado ao cidadão, de racionalização dos processos de resposta a pedidos de informação e de valorização dos canais digitais da organização.</w:t>
+        <w:t>Pelo exposto, o signatário propõe superiormente, a título de melhoria, a criação de uma funcionalidade de Pedidos de Informação na aplicação DGADR DigiSignage, como medida de reforço da qualidade do serviço prestado ao cidadão, de modernização dos canais de comunicação institucional e de racionalização dos processos de resposta a pedidos de informação.</w:t>
       </w:r>
     </w:p>
     <w:p>

</xml_diff>

<commit_message>
Atualiza proposta com fluxo de 3 cenários de resposta e referência ao protótipo
Corrige a descrição do comportamento do assistente para refletir com
precisão o fluxo real: (1) contactos da divisão/entidade quando encontra
na base de conhecimento; (2) pesquisa no site da DGADR quando não
encontra; (3) resposta padrão de redirecionamento quando não encontra em
nenhuma fonte. Adiciona Anexo I para as capturas de ecrã do protótipo.

https://claude.ai/code/session_01NLFgbxzCib86yPwEfnRRtZ
</commit_message>
<xml_diff>
--- a/DGADR-I01209-202605-INF-DSIGA_DPGI_PedidosInformacao.docx
+++ b/DGADR-I01209-202605-INF-DSIGA_DPGI_PedidosInformacao.docx
@@ -96,7 +96,7 @@
           <w:b/>
           <w:sz w:val="22"/>
         </w:rPr>
-        <w:t>Proposta de criação de funcionalidade de Pedidos de Informação na Aplicação Móvel DGADR DigiSignage</w:t>
+        <w:t>Proposta de criação de funcionalidade de Pedidos de Informação na Aplicação Móvel DGADR DigiSignage (protótipo disponível para consideração)</w:t>
       </w:r>
     </w:p>
     <w:p>
@@ -134,7 +134,7 @@
           <w:b w:val="0"/>
           <w:sz w:val="22"/>
         </w:rPr>
-        <w:t>A presente proposta visa colmatar esta lacuna através da criação de uma funcionalidade dedicada aos Pedidos de Informação na aplicação móvel DGADR DigiSignage, tirando partido das capacidades de inteligência artificial generativa para disponibilizar respostas imediatas, em linguagem natural, em qualquer momento e a partir de qualquer localização.</w:t>
+        <w:t>A presente proposta visa colmatar esta lacuna através da criação de uma funcionalidade dedicada aos Pedidos de Informação na aplicação móvel DGADR DigiSignage, tirando partido das capacidades de inteligência artificial generativa para disponibilizar respostas imediatas, em linguagem natural, em qualquer momento e a partir de qualquer localização. Um protótipo desta funcionalidade encontra-se disponível para demonstração, conforme imagens em anexo.</w:t>
       </w:r>
     </w:p>
     <w:p>
@@ -159,7 +159,7 @@
           <w:b w:val="0"/>
           <w:sz w:val="22"/>
         </w:rPr>
-        <w:t>Propõe-se a criação de uma área de Pedidos de Informação na aplicação DGADR DigiSignage, assente num assistente virtual inteligente acessível diretamente no telemóvel do utilizador. Através de uma interface de conversação simples e intuitiva — semelhante às aplicações de mensagens do quotidiano —, o utilizador poderá colocar questões em português corrente e obter respostas imediatas, claras e contextualizadas, sem necessidade de aguardar pelo horário de atendimento ou de preencher formulários.</w:t>
+        <w:t>Propõe-se a criação de uma área de Pedidos de Informação na aplicação DGADR DigiSignage, assente num assistente virtual inteligente acessível diretamente no telemóvel do utilizador. Através de uma interface de conversação simples e intuitiva — semelhante às aplicações de mensagens do quotidiano —, o utilizador poderá colocar questões em português corrente e obter respostas imediatas, sem necessidade de aguardar pelo horário de atendimento ou de preencher formulários.</w:t>
       </w:r>
     </w:p>
     <w:p>
@@ -294,7 +294,19 @@
     </w:p>
     <w:p>
       <w:pPr>
-        <w:spacing w:before="120" w:after="120"/>
+        <w:spacing w:before="240" w:after="80"/>
+      </w:pPr>
+      <w:r>
+        <w:rPr>
+          <w:b/>
+          <w:sz w:val="22"/>
+        </w:rPr>
+        <w:t>Fluxo de Resposta do Assistente</w:t>
+      </w:r>
+    </w:p>
+    <w:p>
+      <w:pPr>
+        <w:spacing w:before="0" w:after="120"/>
         <w:jc w:val="left"/>
       </w:pPr>
       <w:r>
@@ -302,7 +314,98 @@
           <w:b w:val="0"/>
           <w:sz w:val="22"/>
         </w:rPr>
-        <w:t>Sempre que a questão colocada ultrapasse o âmbito da DGADR, o assistente identificará automaticamente a entidade competente — como a APA, o IFAP, a DGAV, o ICNF, as CCDR regionais, entre outras — e apresentará os respetivos contactos, garantindo que o utilizador é sempre orientado para a fonte correta.</w:t>
+        <w:t>O assistente processará cada questão colocada pelo utilizador segundo uma lógica sequencial de três cenários, garantindo sempre uma resposta útil e adequada ao contexto:</w:t>
+      </w:r>
+    </w:p>
+    <w:p>
+      <w:pPr>
+        <w:spacing w:before="80" w:after="40"/>
+        <w:ind w:left="283"/>
+      </w:pPr>
+      <w:r>
+        <w:rPr>
+          <w:b/>
+          <w:sz w:val="22"/>
+        </w:rPr>
+        <w:t>Cenário 1 — Informação disponível na base de conhecimento interna</w:t>
+      </w:r>
+    </w:p>
+    <w:p>
+      <w:pPr>
+        <w:spacing w:before="40" w:after="160"/>
+        <w:jc w:val="left"/>
+      </w:pPr>
+      <w:r>
+        <w:rPr>
+          <w:b w:val="0"/>
+          <w:sz w:val="22"/>
+        </w:rPr>
+        <w:t>Quando a questão colocada corresponde a um tema coberto pela base de conhecimento da DGADR, o assistente identifica a divisão interna competente — como a Divisão de Apoio às Explorações Agrícolas (DAEA), a Divisão de Qualidade e Recursos Genéticos (DQRG), a Divisão de Ordenamento do Espaço Rural (DOER), entre outras — ou, se aplicável, a entidade externa responsável (IFAP, APA, DGAV, CCDR, etc.). A resposta apresenta os contactos diretos dessa divisão ou entidade — telefone e e-mail —, permitindo ao utilizador prosseguir o seu pedido de forma imediata e direcionada.</w:t>
+      </w:r>
+    </w:p>
+    <w:p>
+      <w:pPr>
+        <w:spacing w:before="80" w:after="40"/>
+        <w:ind w:left="283"/>
+      </w:pPr>
+      <w:r>
+        <w:rPr>
+          <w:b/>
+          <w:sz w:val="22"/>
+        </w:rPr>
+        <w:t>Cenário 2 — Informação não disponível na base de conhecimento, mas encontrada no sítio da DGADR</w:t>
+      </w:r>
+    </w:p>
+    <w:p>
+      <w:pPr>
+        <w:spacing w:before="40" w:after="160"/>
+        <w:jc w:val="left"/>
+      </w:pPr>
+      <w:r>
+        <w:rPr>
+          <w:b w:val="0"/>
+          <w:sz w:val="22"/>
+        </w:rPr>
+        <w:t>Quando a questão não encontra correspondência direta na base de conhecimento interna, o assistente realiza automaticamente uma pesquisa no sítio oficial da DGADR (dgadr.gov.pt) e, se necessário, no portal do Ministério da Agricultura. Caso localize informação relevante, apresenta-a ao utilizador de forma sintetizada e em linguagem acessível, com base nos conteúdos oficiais encontrados.</w:t>
+      </w:r>
+    </w:p>
+    <w:p>
+      <w:pPr>
+        <w:spacing w:before="80" w:after="40"/>
+        <w:ind w:left="283"/>
+      </w:pPr>
+      <w:r>
+        <w:rPr>
+          <w:b/>
+          <w:sz w:val="22"/>
+        </w:rPr>
+        <w:t>Cenário 3 — Informação não disponível em nenhuma das fontes consultadas</w:t>
+      </w:r>
+    </w:p>
+    <w:p>
+      <w:pPr>
+        <w:spacing w:before="40" w:after="160"/>
+        <w:jc w:val="left"/>
+      </w:pPr>
+      <w:r>
+        <w:rPr>
+          <w:b w:val="0"/>
+          <w:sz w:val="22"/>
+        </w:rPr>
+        <w:t>Quando não for possível obter informação relevante em nenhuma das fontes — base de conhecimento interna ou sítio oficial —, o assistente apresenta uma resposta padrão informando o utilizador de que não dispõe de informação sobre aquele assunto específico. Neste caso, é sempre disponibilizada uma ligação direta ao canal tradicional de pedidos de informação da DGADR, assegurando que o utilizador dispõe sempre de uma alternativa formal para obter o esclarecimento pretendido.</w:t>
+      </w:r>
+    </w:p>
+    <w:p>
+      <w:pPr>
+        <w:spacing w:before="0" w:after="120"/>
+        <w:jc w:val="left"/>
+      </w:pPr>
+      <w:r>
+        <w:rPr>
+          <w:b w:val="0"/>
+          <w:sz w:val="22"/>
+        </w:rPr>
+        <w:t>Em qualquer dos cenários, a interface mantém o histórico da conversa e permite ao utilizador continuar o diálogo, reformular a questão ou iniciar uma nova conversa em separador independente.</w:t>
       </w:r>
     </w:p>
     <w:p>
@@ -314,7 +417,7 @@
           <w:b/>
           <w:sz w:val="22"/>
         </w:rPr>
-        <w:t>Como Funcionará</w:t>
+        <w:t>Como Utilizar</w:t>
       </w:r>
     </w:p>
     <w:p>
@@ -327,7 +430,7 @@
           <w:b w:val="0"/>
           <w:sz w:val="22"/>
         </w:rPr>
-        <w:t>O fluxo de utilização será simples e não exigirá qualquer conhecimento técnico:</w:t>
+        <w:t>O processo de utilização não exige qualquer conhecimento técnico:</w:t>
       </w:r>
     </w:p>
     <w:p>
@@ -353,7 +456,7 @@
         <w:rPr>
           <w:sz w:val="22"/>
         </w:rPr>
-        <w:t>Escreve a sua questão em linguagem corrente (por exemplo: "Como obtenho o estatuto de Jovem Empresário Rural?");</w:t>
+        <w:t>Escreve a sua questão em linguagem corrente (por exemplo: "Informações sobre gasóleo agrícola" ou "O que é o emparcelamento?");</w:t>
       </w:r>
     </w:p>
     <w:p>
@@ -366,7 +469,7 @@
         <w:rPr>
           <w:sz w:val="22"/>
         </w:rPr>
-        <w:t>O sistema processa a pergunta, consulta a base de conhecimento interna e, se necessário, pesquisa informação atualizada no sítio oficial da DGADR e do Ministério da Agricultura;</w:t>
+        <w:t>O assistente processa a pergunta e apresenta a resposta adequada ao caso — contactos da divisão competente, informação retirada do sítio oficial, ou indicação de reencaminhamento para o canal tradicional;</w:t>
       </w:r>
     </w:p>
     <w:p>
@@ -379,7 +482,7 @@
         <w:rPr>
           <w:sz w:val="22"/>
         </w:rPr>
-        <w:t>O assistente apresenta uma resposta clara, acompanhada dos contactos relevantes (telefone, e-mail ou divisão responsável) para esclarecimentos adicionais;</w:t>
+        <w:t>Se a resposta incluir contactos telefónicos, estes surgirão como botões clicáveis, permitindo iniciar a chamada diretamente a partir da aplicação;</w:t>
       </w:r>
     </w:p>
     <w:p>
@@ -392,20 +495,7 @@
         <w:rPr>
           <w:sz w:val="22"/>
         </w:rPr>
-        <w:t>O utilizador poderá continuar a conversa, colocar novas questões ou gerir múltiplas conversas em simultâneo.</w:t>
-      </w:r>
-    </w:p>
-    <w:p>
-      <w:pPr>
-        <w:spacing w:before="120" w:after="120"/>
-        <w:jc w:val="left"/>
-      </w:pPr>
-      <w:r>
-        <w:rPr>
-          <w:b w:val="0"/>
-          <w:sz w:val="22"/>
-        </w:rPr>
-        <w:t>Para situações que exijam acompanhamento formal, a funcionalidade disponibilizará ainda uma ligação direta ao canal tradicional de pedidos de informação da DGADR, assegurando a continuidade e a rastreabilidade do processo.</w:t>
+        <w:t>O utilizador pode continuar a conversa, abrir novos tópicos em separadores independentes ou aceder ao canal tradicional de pedidos de informação através da ligação disponível na interface.</w:t>
       </w:r>
     </w:p>
     <w:p>
@@ -435,7 +525,7 @@
     </w:p>
     <w:p>
       <w:pPr>
-        <w:spacing w:before="0" w:after="80"/>
+        <w:spacing w:before="0" w:after="100"/>
         <w:ind w:left="567"/>
       </w:pPr>
       <w:r>
@@ -449,12 +539,12 @@
         <w:rPr>
           <w:sz w:val="22"/>
         </w:rPr>
-        <w:t>conjunto de documentos sobre as áreas de competência da DGADR, incorporados na aplicação, que permitirão respostas mesmo sem ligação à internet.</w:t>
+        <w:t>conjunto de documentos sobre as áreas de competência da DGADR e respetivos contactos por divisão, incorporados na aplicação, que suportam o Cenário 1 de resposta.</w:t>
       </w:r>
     </w:p>
     <w:p>
       <w:pPr>
-        <w:spacing w:before="0" w:after="80"/>
+        <w:spacing w:before="0" w:after="100"/>
         <w:ind w:left="567"/>
       </w:pPr>
       <w:r>
@@ -468,12 +558,12 @@
         <w:rPr>
           <w:sz w:val="22"/>
         </w:rPr>
-        <w:t>quando necessário, o assistente consultará automaticamente os sítios oficiais da DGADR e do Ministério da Agricultura, garantindo informação sempre atualizada.</w:t>
+        <w:t>quando a base de conhecimento não é suficiente, o assistente consulta automaticamente os sítios oficiais da DGADR e do Ministério da Agricultura, suportando o Cenário 2 de resposta.</w:t>
       </w:r>
     </w:p>
     <w:p>
       <w:pPr>
-        <w:spacing w:before="0" w:after="80"/>
+        <w:spacing w:before="0" w:after="100"/>
         <w:ind w:left="567"/>
       </w:pPr>
       <w:r>
@@ -487,12 +577,12 @@
         <w:rPr>
           <w:sz w:val="22"/>
         </w:rPr>
-        <w:t>base de dados com os contactos das divisões internas da DGADR e das principais entidades externas do setor, permitindo encaminhamentos precisos e úteis.</w:t>
+        <w:t>base de dados com os contactos das divisões internas da DGADR e das principais entidades externas do setor (IFAP, APA, DGAV, ICNF, CCDR, entre outras), apresentados como botões clicáveis para chamada direta.</w:t>
       </w:r>
     </w:p>
     <w:p>
       <w:pPr>
-        <w:spacing w:before="0" w:after="80"/>
+        <w:spacing w:before="0" w:after="100"/>
         <w:ind w:left="567"/>
       </w:pPr>
       <w:r>
@@ -506,7 +596,7 @@
         <w:rPr>
           <w:sz w:val="22"/>
         </w:rPr>
-        <w:t>modelo de linguagem natural que interpretará as questões dos utilizadores e gerará respostas coerentes, em português, adaptadas ao contexto da DGADR.</w:t>
+        <w:t>modelo de linguagem natural que interpreta as questões dos utilizadores, gere o fluxo de resposta entre os três cenários e garante comunicação em português claro e acessível.</w:t>
       </w:r>
     </w:p>
     <w:p>
@@ -557,7 +647,7 @@
         <w:rPr>
           <w:sz w:val="22"/>
         </w:rPr>
-        <w:t>Resposta imediata: o utilizador obterá informação relevante no momento, reduzindo o tempo de espera face ao canal tradicional de pedidos escritos;</w:t>
+        <w:t>Resposta imediata e direcionada: o utilizador é encaminhado diretamente para a divisão ou entidade competente, com os contactos necessários para prosseguir o pedido;</w:t>
       </w:r>
     </w:p>
     <w:p>
@@ -570,7 +660,7 @@
         <w:rPr>
           <w:sz w:val="22"/>
         </w:rPr>
-        <w:t>Linguagem acessível: as respostas serão apresentadas em linguagem simples e clara, sem recurso a terminologia técnica desnecessária;</w:t>
+        <w:t>Cobertura progressiva: a lógica de três cenários garante que o utilizador recebe sempre uma resposta útil, mesmo quando o tema não consta da base de conhecimento;</w:t>
       </w:r>
     </w:p>
     <w:p>
@@ -583,7 +673,7 @@
         <w:rPr>
           <w:sz w:val="22"/>
         </w:rPr>
-        <w:t>Encaminhamento inteligente: quando a questão não for da competência da DGADR, o sistema identificará automaticamente a entidade correta, evitando que o utilizador fique sem orientação;</w:t>
+        <w:t>Contacto direto facilitado: os números de telefone das divisões competentes surgem como botões clicáveis, eliminando a necessidade de procurar os contactos manualmente;</w:t>
       </w:r>
     </w:p>
     <w:p>
@@ -596,7 +686,7 @@
         <w:rPr>
           <w:sz w:val="22"/>
         </w:rPr>
-        <w:t>Redução da carga administrativa: ao resolver de forma autónoma um volume significativo de questões recorrentes, a funcionalidade libertará os colaboradores da DGADR para tarefas de maior valor acrescentado;</w:t>
+        <w:t>Redução da carga administrativa: ao encaminhar de forma autónoma um volume significativo de questões recorrentes, a funcionalidade liberta os colaboradores da DGADR para tarefas de maior valor acrescentado;</w:t>
       </w:r>
     </w:p>
     <w:p>
@@ -609,7 +699,7 @@
         <w:rPr>
           <w:sz w:val="22"/>
         </w:rPr>
-        <w:t>Acesso móvel e intuitivo: a interface de conversação será familiar para qualquer utilizador de telemóvel, não exigindo formação prévia nem instalação de software adicional;</w:t>
+        <w:t>Acesso móvel e intuitivo: a interface de conversação é familiar para qualquer utilizador de telemóvel, não exigindo formação prévia;</w:t>
       </w:r>
     </w:p>
     <w:p>
@@ -622,7 +712,7 @@
         <w:rPr>
           <w:sz w:val="22"/>
         </w:rPr>
-        <w:t>Informação consistente e fiável: as respostas basear-se-ão em fontes oficiais, assegurando coerência e rigor na informação prestada;</w:t>
+        <w:t>Articulação com o canal formal: em todos os cenários, o utilizador tem acesso à ligação para o canal tradicional de pedidos de informação, assegurando a continuidade do serviço;</w:t>
       </w:r>
     </w:p>
     <w:p>
@@ -635,7 +725,7 @@
         <w:rPr>
           <w:sz w:val="22"/>
         </w:rPr>
-        <w:t>Cobertura multidivisional: o assistente abrangerá as principais áreas temáticas da DGADR, constituindo um ponto de entrada único para qualquer questão relacionada com a organização.</w:t>
+        <w:t>Informação baseada em fontes oficiais: as respostas assentam exclusivamente em conteúdos da base de conhecimento interna e dos sítios oficiais da DGADR e do Ministério da Agricultura.</w:t>
       </w:r>
     </w:p>
     <w:p>
@@ -660,7 +750,7 @@
           <w:b w:val="0"/>
           <w:sz w:val="22"/>
         </w:rPr>
-        <w:t>A criação de uma funcionalidade de Pedidos de Informação na aplicação DGADR DigiSignage constituirá uma melhoria concreta e significativa na forma como a DGADR presta informação ao cidadão e orienta os seus utilizadores. Trata-se de uma solução tecnologicamente atual, funcional e de fácil utilização, que colocará ao dispor do cidadão e dos colaboradores um canal de apoio inteligente, disponível em permanência e integrado com as fontes oficiais da organização.</w:t>
+        <w:t>A criação de uma funcionalidade de Pedidos de Informação na aplicação DGADR DigiSignage constituirá uma melhoria concreta e significativa na forma como a DGADR presta informação ao cidadão. A lógica de resposta em três cenários — encaminhamento para a divisão competente com contactos diretos, pesquisa no sítio oficial, ou indicação de reencaminhamento para o canal formal — garante que o utilizador dispõe sempre de uma resposta útil, independentemente da especificidade da questão colocada.</w:t>
       </w:r>
     </w:p>
     <w:p>
@@ -673,7 +763,7 @@
           <w:b w:val="0"/>
           <w:sz w:val="22"/>
         </w:rPr>
-        <w:t>A proposta é tecnicamente exequível no âmbito da aplicação DGADR DigiSignage já em desenvolvimento, não exigindo infraestrutura adicional de relevo, e o seu impacto positivo na qualidade do serviço prestado ao cidadão é imediato e mensurável.</w:t>
+        <w:t>A proposta é tecnicamente exequível no âmbito da aplicação DGADR DigiSignage já em desenvolvimento, não exigindo infraestrutura adicional de relevo, e o seu impacto positivo na qualidade do serviço prestado ao cidadão é imediato e mensurável. O protótipo disponível para demonstração permite validar o conceito antes de qualquer decisão de implementação definitiva.</w:t>
       </w:r>
     </w:p>
     <w:p>
@@ -726,6 +816,124 @@
           <w:sz w:val="22"/>
         </w:rPr>
         <w:t>(Técnico Superior)</w:t>
+      </w:r>
+    </w:p>
+    <w:p>
+      <w:r>
+        <w:br w:type="page"/>
+      </w:r>
+    </w:p>
+    <w:p>
+      <w:pPr>
+        <w:spacing w:before="0" w:after="120"/>
+      </w:pPr>
+      <w:r>
+        <w:rPr>
+          <w:b/>
+          <w:sz w:val="24"/>
+        </w:rPr>
+        <w:t>Anexo I</w:t>
+      </w:r>
+    </w:p>
+    <w:p>
+      <w:pPr>
+        <w:spacing w:before="0" w:after="200"/>
+      </w:pPr>
+      <w:r>
+        <w:rPr>
+          <w:b/>
+          <w:sz w:val="22"/>
+        </w:rPr>
+        <w:t>Protótipo da Funcionalidade de Pedidos de Informação</w:t>
+      </w:r>
+    </w:p>
+    <w:p>
+      <w:pPr>
+        <w:spacing w:before="0" w:after="200"/>
+        <w:jc w:val="left"/>
+      </w:pPr>
+      <w:r>
+        <w:rPr>
+          <w:b w:val="0"/>
+          <w:sz w:val="22"/>
+        </w:rPr>
+        <w:t>As imagens seguintes ilustram o protótipo da funcionalidade de Pedidos de Informação desenvolvido no âmbito da aplicação DGADR DigiSignage, demonstrando os três cenários de resposta descritos na presente proposta.</w:t>
+      </w:r>
+    </w:p>
+    <w:p>
+      <w:pPr>
+        <w:spacing w:before="120" w:after="80"/>
+        <w:ind w:left="283"/>
+      </w:pPr>
+      <w:r>
+        <w:rPr>
+          <w:b/>
+          <w:sz w:val="20"/>
+        </w:rPr>
+        <w:t xml:space="preserve">[Imagem] </w:t>
+      </w:r>
+      <w:r>
+        <w:rPr>
+          <w:sz w:val="20"/>
+        </w:rPr>
+        <w:t>Figura 1 — Cenário 1: Questão sobre emparcelamento — o assistente identifica a divisão competente (DAEA) e apresenta os contactos diretos.</w:t>
+      </w:r>
+    </w:p>
+    <w:p>
+      <w:pPr>
+        <w:spacing w:before="120" w:after="80"/>
+        <w:ind w:left="283"/>
+      </w:pPr>
+      <w:r>
+        <w:rPr>
+          <w:b/>
+          <w:sz w:val="20"/>
+        </w:rPr>
+        <w:t xml:space="preserve">[Imagem] </w:t>
+      </w:r>
+      <w:r>
+        <w:rPr>
+          <w:sz w:val="20"/>
+        </w:rPr>
+        <w:t>Figura 2 — Cenário 2: Questão sobre as antigas DRAP — o assistente responde com base em informação encontrada nas fontes oficiais.</w:t>
+      </w:r>
+    </w:p>
+    <w:p>
+      <w:pPr>
+        <w:spacing w:before="120" w:after="80"/>
+        <w:ind w:left="283"/>
+      </w:pPr>
+      <w:r>
+        <w:rPr>
+          <w:b/>
+          <w:sz w:val="20"/>
+        </w:rPr>
+        <w:t xml:space="preserve">[Imagem] </w:t>
+      </w:r>
+      <w:r>
+        <w:rPr>
+          <w:sz w:val="20"/>
+        </w:rPr>
+        <w:t>Figura 3 — Cenário 1: Questão sobre gasóleo agrícola — encaminhamento para a DAEA com botões de chamada direta.</w:t>
+      </w:r>
+    </w:p>
+    <w:p>
+      <w:pPr>
+        <w:spacing w:before="0" w:after="80"/>
+        <w:jc w:val="left"/>
+      </w:pPr>
+    </w:p>
+    <w:p>
+      <w:pPr>
+        <w:spacing w:before="0" w:after="80"/>
+        <w:jc w:val="left"/>
+      </w:pPr>
+      <w:r>
+        <w:rPr>
+          <w:b w:val="0"/>
+          <w:sz w:val="20"/>
+        </w:rPr>
+        <w:t>Nota: As imagens do protótipo serão anexadas em ficheiro separado ou incorporadas na versão final do documento, conforme indicação superior.</w:t>
       </w:r>
     </w:p>
     <w:sectPr>

</xml_diff>